<commit_message>
docs: align APIs/auth/cache report with the activity rubric
- Section titles follow the three required items (Consumo de APIs,
  Autenticação e sessões, Caching local)
- Adds the list of updated screens and the GitHub link to the API
  section, a per-screen session table and a table of cached items
- Starts each section on a new page via the heading (no blank pages);
  report is now 7 pages

Co-Authored-By: Claude Opus 5.5 <noreply@anthropic.com>
Claude-Session: https://claude.ai/code/session_01J8RXrrAsBDc2k4BBdSb3ob
</commit_message>
<xml_diff>
--- a/docs/TamyresOgasawaraMacedo-ReUse-APIs-Auth-Cache.docx
+++ b/docs/TamyresOgasawaraMacedo-ReUse-APIs-Auth-Cache.docx
@@ -326,12 +326,8 @@
       </w:r>
     </w:p>
     <w:p>
-      <w:r>
-        <w:br w:type="page"/>
-      </w:r>
-    </w:p>
-    <w:p>
       <w:pPr>
+        <w:pageBreakBefore/>
         <w:spacing w:before="40" w:after="160"/>
       </w:pPr>
       <w:r>
@@ -666,12 +662,8 @@
       </w:r>
     </w:p>
     <w:p>
-      <w:r>
-        <w:br w:type="page"/>
-      </w:r>
-    </w:p>
-    <w:p>
       <w:pPr>
+        <w:pageBreakBefore/>
         <w:spacing w:before="40" w:after="160"/>
       </w:pPr>
       <w:r>
@@ -680,7 +672,7 @@
           <w:color w:val="101713"/>
           <w:sz w:val="46"/>
         </w:rPr>
-        <w:t>2. APIs utilizadas</w:t>
+        <w:t>2. Consumo de APIs</w:t>
       </w:r>
     </w:p>
     <w:p>
@@ -693,51 +685,8 @@
           <w:color w:val="42634F"/>
           <w:sz w:val="22"/>
         </w:rPr>
-        <w:t>Duas integrações externas cobrem autenticação e conteúdo</w:t>
+        <w:t>APIs utilizadas, telas atualizadas e código-fonte</w:t>
       </w:r>
-    </w:p>
-    <w:tbl>
-      <w:tblPr>
-        <w:tblW w:type="auto" w:w="0"/>
-        <w:jc w:val="left"/>
-        <w:tblLayout w:type="autofit"/>
-        <w:tblLook w:firstColumn="1" w:firstRow="1" w:lastColumn="0" w:lastRow="0" w:noHBand="0" w:noVBand="1" w:val="04A0"/>
-      </w:tblPr>
-      <w:tblGrid>
-        <w:gridCol w:w="9866"/>
-      </w:tblGrid>
-      <w:tr>
-        <w:tc>
-          <w:tcPr>
-            <w:tcW w:type="dxa" w:w="9866"/>
-            <w:shd w:fill="F4FFD7"/>
-            <w:tcMar>
-              <w:top w:w="70" w:type="dxa"/>
-              <w:start w:w="140" w:type="dxa"/>
-              <w:bottom w:w="70" w:type="dxa"/>
-              <w:end w:w="140" w:type="dxa"/>
-            </w:tcMar>
-          </w:tcPr>
-          <w:p>
-            <w:pPr>
-              <w:spacing w:after="0"/>
-            </w:pPr>
-            <w:r>
-              <w:rPr>
-                <w:b/>
-                <w:color w:val="173F2A"/>
-                <w:sz w:val="18"/>
-              </w:rPr>
-              <w:t>API PÚBLICA · DUMMYJSON</w:t>
-            </w:r>
-          </w:p>
-        </w:tc>
-      </w:tr>
-    </w:tbl>
-    <w:p>
-      <w:pPr>
-        <w:spacing w:after="0"/>
-      </w:pPr>
     </w:p>
     <w:p>
       <w:pPr>
@@ -762,15 +711,6 @@
       </w:pPr>
       <w:r>
         <w:t>A LoginScreen valida os campos e envia username, password e validade de 60 minutos. A resposta é validada antes de gerar uma sessão com accessToken, refreshToken e dados normalizados do usuário. Credenciais recusadas (HTTP 400) e outras falhas produzem mensagens claras sem liberar a navegação.</w:t>
-      </w:r>
-    </w:p>
-    <w:p>
-      <w:pPr>
-        <w:pStyle w:val="ListBullet"/>
-        <w:spacing w:after="60"/>
-      </w:pPr>
-      <w:r>
-        <w:t>Telas afetadas: Boas-vindas → LoginScreen → navegação principal.</w:t>
       </w:r>
     </w:p>
     <w:p>
@@ -822,34 +762,301 @@
         <w:spacing w:after="60"/>
       </w:pPr>
       <w:r>
-        <w:t>Tela afetada: ExploreScreen (Catálogo online).</w:t>
+        <w:t>Estados visuais: carregando, sucesso, erro, retry, cache e offline; Atualizar catálogo força nova requisição.</w:t>
       </w:r>
     </w:p>
     <w:p>
       <w:pPr>
-        <w:pStyle w:val="ListBullet"/>
-        <w:spacing w:after="60"/>
+        <w:pStyle w:val="Heading1"/>
+        <w:spacing w:before="200" w:after="100"/>
       </w:pPr>
       <w:r>
-        <w:t>Estados visuais: carregando, sucesso, erro, retry, cache e offline.</w:t>
+        <w:t>2.3 Telas atualizadas</w:t>
       </w:r>
     </w:p>
+    <w:tbl>
+      <w:tblPr>
+        <w:tblW w:type="auto" w:w="0"/>
+        <w:jc w:val="center"/>
+        <w:tblLayout w:type="fixed"/>
+        <w:tblLook w:firstColumn="1" w:firstRow="1" w:lastColumn="0" w:lastRow="0" w:noHBand="0" w:noVBand="1" w:val="04A0"/>
+      </w:tblPr>
+      <w:tblGrid>
+        <w:gridCol w:w="4933"/>
+        <w:gridCol w:w="4933"/>
+      </w:tblGrid>
+      <w:tr>
+        <w:tc>
+          <w:tcPr>
+            <w:tcW w:type="dxa" w:w="3175"/>
+            <w:shd w:fill="173F2A"/>
+            <w:tcMar>
+              <w:top w:w="100" w:type="dxa"/>
+              <w:start w:w="120" w:type="dxa"/>
+              <w:bottom w:w="100" w:type="dxa"/>
+              <w:end w:w="120" w:type="dxa"/>
+            </w:tcMar>
+          </w:tcPr>
+          <w:p>
+            <w:r>
+              <w:rPr>
+                <w:b/>
+                <w:color w:val="FFFFFF"/>
+              </w:rPr>
+              <w:t>Tela</w:t>
+            </w:r>
+          </w:p>
+        </w:tc>
+        <w:tc>
+          <w:tcPr>
+            <w:tcW w:type="dxa" w:w="6236"/>
+            <w:shd w:fill="173F2A"/>
+            <w:tcMar>
+              <w:top w:w="100" w:type="dxa"/>
+              <w:start w:w="120" w:type="dxa"/>
+              <w:bottom w:w="100" w:type="dxa"/>
+              <w:end w:w="120" w:type="dxa"/>
+            </w:tcMar>
+          </w:tcPr>
+          <w:p>
+            <w:r>
+              <w:rPr>
+                <w:b/>
+                <w:color w:val="FFFFFF"/>
+              </w:rPr>
+              <w:t>O que mudou</w:t>
+            </w:r>
+          </w:p>
+        </w:tc>
+      </w:tr>
+      <w:tr>
+        <w:tc>
+          <w:tcPr>
+            <w:tcW w:type="dxa" w:w="3175"/>
+            <w:shd w:fill="F4FFD7"/>
+            <w:tcMar>
+              <w:top w:w="100" w:type="dxa"/>
+              <w:start w:w="120" w:type="dxa"/>
+              <w:bottom w:w="100" w:type="dxa"/>
+              <w:end w:w="120" w:type="dxa"/>
+            </w:tcMar>
+          </w:tcPr>
+          <w:p>
+            <w:r>
+              <w:t>Boas-vindas (WelcomeScreen)</w:t>
+            </w:r>
+          </w:p>
+        </w:tc>
+        <w:tc>
+          <w:tcPr>
+            <w:tcW w:type="dxa" w:w="6236"/>
+            <w:shd w:fill="F4FFD7"/>
+            <w:tcMar>
+              <w:top w:w="100" w:type="dxa"/>
+              <w:start w:w="120" w:type="dxa"/>
+              <w:bottom w:w="100" w:type="dxa"/>
+              <w:end w:w="120" w:type="dxa"/>
+            </w:tcMar>
+          </w:tcPr>
+          <w:p>
+            <w:r>
+              <w:t>O botão Começar a explorar passa a levar ao login.</w:t>
+            </w:r>
+          </w:p>
+        </w:tc>
+      </w:tr>
+      <w:tr>
+        <w:tc>
+          <w:tcPr>
+            <w:tcW w:type="dxa" w:w="3175"/>
+            <w:shd w:fill="FFFFFF"/>
+            <w:tcMar>
+              <w:top w:w="100" w:type="dxa"/>
+              <w:start w:w="120" w:type="dxa"/>
+              <w:bottom w:w="100" w:type="dxa"/>
+              <w:end w:w="120" w:type="dxa"/>
+            </w:tcMar>
+          </w:tcPr>
+          <w:p>
+            <w:r>
+              <w:t>Login (LoginScreen) — nova</w:t>
+            </w:r>
+          </w:p>
+        </w:tc>
+        <w:tc>
+          <w:tcPr>
+            <w:tcW w:type="dxa" w:w="6236"/>
+            <w:shd w:fill="FFFFFF"/>
+            <w:tcMar>
+              <w:top w:w="100" w:type="dxa"/>
+              <w:start w:w="120" w:type="dxa"/>
+              <w:bottom w:w="100" w:type="dxa"/>
+              <w:end w:w="120" w:type="dxa"/>
+            </w:tcMar>
+          </w:tcPr>
+          <w:p>
+            <w:r>
+              <w:t>Formulário integrado ao POST /auth/login, com validação e mensagens de erro.</w:t>
+            </w:r>
+          </w:p>
+        </w:tc>
+      </w:tr>
+      <w:tr>
+        <w:tc>
+          <w:tcPr>
+            <w:tcW w:type="dxa" w:w="3175"/>
+            <w:shd w:fill="F4FFD7"/>
+            <w:tcMar>
+              <w:top w:w="100" w:type="dxa"/>
+              <w:start w:w="120" w:type="dxa"/>
+              <w:bottom w:w="100" w:type="dxa"/>
+              <w:end w:w="120" w:type="dxa"/>
+            </w:tcMar>
+          </w:tcPr>
+          <w:p>
+            <w:r>
+              <w:t>Início (HomeScreen)</w:t>
+            </w:r>
+          </w:p>
+        </w:tc>
+        <w:tc>
+          <w:tcPr>
+            <w:tcW w:type="dxa" w:w="6236"/>
+            <w:shd w:fill="F4FFD7"/>
+            <w:tcMar>
+              <w:top w:w="100" w:type="dxa"/>
+              <w:start w:w="120" w:type="dxa"/>
+              <w:bottom w:w="100" w:type="dxa"/>
+              <w:end w:w="120" w:type="dxa"/>
+            </w:tcMar>
+          </w:tcPr>
+          <w:p>
+            <w:r>
+              <w:t>Saudação com o nome da sessão e cartão que abre o Catálogo online.</w:t>
+            </w:r>
+          </w:p>
+        </w:tc>
+      </w:tr>
+      <w:tr>
+        <w:tc>
+          <w:tcPr>
+            <w:tcW w:type="dxa" w:w="3175"/>
+            <w:shd w:fill="FFFFFF"/>
+            <w:tcMar>
+              <w:top w:w="100" w:type="dxa"/>
+              <w:start w:w="120" w:type="dxa"/>
+              <w:bottom w:w="100" w:type="dxa"/>
+              <w:end w:w="120" w:type="dxa"/>
+            </w:tcMar>
+          </w:tcPr>
+          <w:p>
+            <w:r>
+              <w:t>Catálogo online (ExploreScreen) — nova</w:t>
+            </w:r>
+          </w:p>
+        </w:tc>
+        <w:tc>
+          <w:tcPr>
+            <w:tcW w:type="dxa" w:w="6236"/>
+            <w:shd w:fill="FFFFFF"/>
+            <w:tcMar>
+              <w:top w:w="100" w:type="dxa"/>
+              <w:start w:w="120" w:type="dxa"/>
+              <w:bottom w:w="100" w:type="dxa"/>
+              <w:end w:w="120" w:type="dxa"/>
+            </w:tcMar>
+          </w:tcPr>
+          <w:p>
+            <w:r>
+              <w:t>Produtos do GET /products, com cache local, aviso offline, retry e atualização manual.</w:t>
+            </w:r>
+          </w:p>
+        </w:tc>
+      </w:tr>
+      <w:tr>
+        <w:tc>
+          <w:tcPr>
+            <w:tcW w:type="dxa" w:w="3175"/>
+            <w:shd w:fill="F4FFD7"/>
+            <w:tcMar>
+              <w:top w:w="100" w:type="dxa"/>
+              <w:start w:w="120" w:type="dxa"/>
+              <w:bottom w:w="100" w:type="dxa"/>
+              <w:end w:w="120" w:type="dxa"/>
+            </w:tcMar>
+          </w:tcPr>
+          <w:p>
+            <w:r>
+              <w:t>Perfil (ProfileScreen)</w:t>
+            </w:r>
+          </w:p>
+        </w:tc>
+        <w:tc>
+          <w:tcPr>
+            <w:tcW w:type="dxa" w:w="6236"/>
+            <w:shd w:fill="F4FFD7"/>
+            <w:tcMar>
+              <w:top w:w="100" w:type="dxa"/>
+              <w:start w:w="120" w:type="dxa"/>
+              <w:bottom w:w="100" w:type="dxa"/>
+              <w:end w:w="120" w:type="dxa"/>
+            </w:tcMar>
+          </w:tcPr>
+          <w:p>
+            <w:r>
+              <w:t>Nome e usuário da sessão e botão Sair.</w:t>
+            </w:r>
+          </w:p>
+        </w:tc>
+      </w:tr>
+    </w:tbl>
+    <w:p/>
     <w:p>
       <w:pPr>
-        <w:pStyle w:val="ListBullet"/>
-        <w:spacing w:after="60"/>
+        <w:pStyle w:val="Heading1"/>
+        <w:spacing w:before="200" w:after="100"/>
       </w:pPr>
       <w:r>
-        <w:t>Atualização manual: o botão Atualizar catálogo ignora o TTL e força nova requisição.</w:t>
+        <w:t>2.4 Código-fonte React Native</w:t>
       </w:r>
     </w:p>
     <w:p>
       <w:r>
-        <w:br w:type="page"/>
+        <w:rPr>
+          <w:b/>
+        </w:rPr>
+        <w:t xml:space="preserve">GitHub: </w:t>
       </w:r>
+      <w:hyperlink r:id="rId11">
+        <w:r>
+          <w:rPr>
+            <w:color w:val="42634F"/>
+            <w:u w:val="single"/>
+          </w:rPr>
+          <w:t>https://github.com/tamyresogasawara/reuse-mobile-fiap-sprint-2</w:t>
+        </w:r>
+      </w:hyperlink>
+    </w:p>
+    <w:p>
+      <w:r>
+        <w:rPr>
+          <w:b/>
+        </w:rPr>
+        <w:t xml:space="preserve">Aplicação web: </w:t>
+      </w:r>
+      <w:hyperlink r:id="rId12">
+        <w:r>
+          <w:rPr>
+            <w:color w:val="42634F"/>
+            <w:u w:val="single"/>
+          </w:rPr>
+          <w:t>https://tamyresogasawara.github.io/reuse-mobile-fiap-sprint-2/</w:t>
+        </w:r>
+      </w:hyperlink>
     </w:p>
     <w:p>
       <w:pPr>
+        <w:pageBreakBefore/>
         <w:spacing w:before="40" w:after="160"/>
       </w:pPr>
       <w:r>
@@ -858,7 +1065,7 @@
           <w:color w:val="101713"/>
           <w:sz w:val="46"/>
         </w:rPr>
-        <w:t>3. Autenticação e gerenciamento de sessão</w:t>
+        <w:t>3. Autenticação e sessões</w:t>
       </w:r>
     </w:p>
     <w:p>
@@ -871,7 +1078,695 @@
           <w:color w:val="42634F"/>
           <w:sz w:val="22"/>
         </w:rPr>
-        <w:t>Fluxo protegido do acesso ao logout</w:t>
+        <w:t>Telas em que foram aplicadas</w:t>
+      </w:r>
+    </w:p>
+    <w:tbl>
+      <w:tblPr>
+        <w:tblW w:type="auto" w:w="0"/>
+        <w:jc w:val="center"/>
+        <w:tblLayout w:type="fixed"/>
+        <w:tblLook w:firstColumn="1" w:firstRow="1" w:lastColumn="0" w:lastRow="0" w:noHBand="0" w:noVBand="1" w:val="04A0"/>
+      </w:tblPr>
+      <w:tblGrid>
+        <w:gridCol w:w="4933"/>
+        <w:gridCol w:w="4933"/>
+      </w:tblGrid>
+      <w:tr>
+        <w:tc>
+          <w:tcPr>
+            <w:tcW w:type="dxa" w:w="2608"/>
+            <w:shd w:fill="173F2A"/>
+            <w:tcMar>
+              <w:top w:w="100" w:type="dxa"/>
+              <w:start w:w="120" w:type="dxa"/>
+              <w:bottom w:w="100" w:type="dxa"/>
+              <w:end w:w="120" w:type="dxa"/>
+            </w:tcMar>
+          </w:tcPr>
+          <w:p>
+            <w:r>
+              <w:rPr>
+                <w:b/>
+                <w:color w:val="FFFFFF"/>
+              </w:rPr>
+              <w:t>Tela</w:t>
+            </w:r>
+          </w:p>
+        </w:tc>
+        <w:tc>
+          <w:tcPr>
+            <w:tcW w:type="dxa" w:w="6803"/>
+            <w:shd w:fill="173F2A"/>
+            <w:tcMar>
+              <w:top w:w="100" w:type="dxa"/>
+              <w:start w:w="120" w:type="dxa"/>
+              <w:bottom w:w="100" w:type="dxa"/>
+              <w:end w:w="120" w:type="dxa"/>
+            </w:tcMar>
+          </w:tcPr>
+          <w:p>
+            <w:r>
+              <w:rPr>
+                <w:b/>
+                <w:color w:val="FFFFFF"/>
+              </w:rPr>
+              <w:t>Uso da autenticação e da sessão</w:t>
+            </w:r>
+          </w:p>
+        </w:tc>
+      </w:tr>
+      <w:tr>
+        <w:tc>
+          <w:tcPr>
+            <w:tcW w:type="dxa" w:w="2608"/>
+            <w:shd w:fill="F4FFD7"/>
+            <w:tcMar>
+              <w:top w:w="100" w:type="dxa"/>
+              <w:start w:w="120" w:type="dxa"/>
+              <w:bottom w:w="100" w:type="dxa"/>
+              <w:end w:w="120" w:type="dxa"/>
+            </w:tcMar>
+          </w:tcPr>
+          <w:p>
+            <w:r>
+              <w:t>Boas-vindas e Login</w:t>
+            </w:r>
+          </w:p>
+        </w:tc>
+        <w:tc>
+          <w:tcPr>
+            <w:tcW w:type="dxa" w:w="6803"/>
+            <w:shd w:fill="F4FFD7"/>
+            <w:tcMar>
+              <w:top w:w="100" w:type="dxa"/>
+              <w:start w:w="120" w:type="dxa"/>
+              <w:bottom w:w="100" w:type="dxa"/>
+              <w:end w:w="120" w:type="dxa"/>
+            </w:tcMar>
+          </w:tcPr>
+          <w:p>
+            <w:r>
+              <w:t>Exibidas somente sem sessão válida; o login cria e salva a sessão.</w:t>
+            </w:r>
+          </w:p>
+        </w:tc>
+      </w:tr>
+      <w:tr>
+        <w:tc>
+          <w:tcPr>
+            <w:tcW w:type="dxa" w:w="2608"/>
+            <w:shd w:fill="FFFFFF"/>
+            <w:tcMar>
+              <w:top w:w="100" w:type="dxa"/>
+              <w:start w:w="120" w:type="dxa"/>
+              <w:bottom w:w="100" w:type="dxa"/>
+              <w:end w:w="120" w:type="dxa"/>
+            </w:tcMar>
+          </w:tcPr>
+          <w:p>
+            <w:r>
+              <w:t>Início</w:t>
+            </w:r>
+          </w:p>
+        </w:tc>
+        <w:tc>
+          <w:tcPr>
+            <w:tcW w:type="dxa" w:w="6803"/>
+            <w:shd w:fill="FFFFFF"/>
+            <w:tcMar>
+              <w:top w:w="100" w:type="dxa"/>
+              <w:start w:w="120" w:type="dxa"/>
+              <w:bottom w:w="100" w:type="dxa"/>
+              <w:end w:w="120" w:type="dxa"/>
+            </w:tcMar>
+          </w:tcPr>
+          <w:p>
+            <w:r>
+              <w:t>Mostra o nome do usuário autenticado.</w:t>
+            </w:r>
+          </w:p>
+        </w:tc>
+      </w:tr>
+      <w:tr>
+        <w:tc>
+          <w:tcPr>
+            <w:tcW w:type="dxa" w:w="2608"/>
+            <w:shd w:fill="F4FFD7"/>
+            <w:tcMar>
+              <w:top w:w="100" w:type="dxa"/>
+              <w:start w:w="120" w:type="dxa"/>
+              <w:bottom w:w="100" w:type="dxa"/>
+              <w:end w:w="120" w:type="dxa"/>
+            </w:tcMar>
+          </w:tcPr>
+          <w:p>
+            <w:r>
+              <w:t>Perfil</w:t>
+            </w:r>
+          </w:p>
+        </w:tc>
+        <w:tc>
+          <w:tcPr>
+            <w:tcW w:type="dxa" w:w="6803"/>
+            <w:shd w:fill="F4FFD7"/>
+            <w:tcMar>
+              <w:top w:w="100" w:type="dxa"/>
+              <w:start w:w="120" w:type="dxa"/>
+              <w:bottom w:w="100" w:type="dxa"/>
+              <w:end w:w="120" w:type="dxa"/>
+            </w:tcMar>
+          </w:tcPr>
+          <w:p>
+            <w:r>
+              <w:t>Mostra nome e usuário; o botão Sair encerra a sessão.</w:t>
+            </w:r>
+          </w:p>
+        </w:tc>
+      </w:tr>
+      <w:tr>
+        <w:tc>
+          <w:tcPr>
+            <w:tcW w:type="dxa" w:w="2608"/>
+            <w:shd w:fill="FFFFFF"/>
+            <w:tcMar>
+              <w:top w:w="100" w:type="dxa"/>
+              <w:start w:w="120" w:type="dxa"/>
+              <w:bottom w:w="100" w:type="dxa"/>
+              <w:end w:w="120" w:type="dxa"/>
+            </w:tcMar>
+          </w:tcPr>
+          <w:p>
+            <w:r>
+              <w:t>Demais telas</w:t>
+            </w:r>
+          </w:p>
+        </w:tc>
+        <w:tc>
+          <w:tcPr>
+            <w:tcW w:type="dxa" w:w="6803"/>
+            <w:shd w:fill="FFFFFF"/>
+            <w:tcMar>
+              <w:top w:w="100" w:type="dxa"/>
+              <w:start w:w="120" w:type="dxa"/>
+              <w:bottom w:w="100" w:type="dxa"/>
+              <w:end w:w="120" w:type="dxa"/>
+            </w:tcMar>
+          </w:tcPr>
+          <w:p>
+            <w:r>
+              <w:t>Abas, Detalhes, Catálogo online, Meus anúncios e Meu impacto só são montadas com sessão válida.</w:t>
+            </w:r>
+          </w:p>
+        </w:tc>
+      </w:tr>
+    </w:tbl>
+    <w:p/>
+    <w:tbl>
+      <w:tblPr>
+        <w:tblW w:type="auto" w:w="0"/>
+        <w:jc w:val="center"/>
+        <w:tblLook w:firstColumn="1" w:firstRow="1" w:lastColumn="0" w:lastRow="0" w:noHBand="0" w:noVBand="1" w:val="04A0"/>
+      </w:tblPr>
+      <w:tblGrid>
+        <w:gridCol w:w="3289"/>
+        <w:gridCol w:w="3289"/>
+        <w:gridCol w:w="3289"/>
+      </w:tblGrid>
+      <w:tr>
+        <w:tc>
+          <w:tcPr>
+            <w:tcW w:type="dxa" w:w="3289"/>
+          </w:tcPr>
+          <w:p>
+            <w:pPr>
+              <w:jc w:val="center"/>
+            </w:pPr>
+            <w:r>
+              <w:drawing>
+                <wp:inline xmlns:a="http://schemas.openxmlformats.org/drawingml/2006/main" xmlns:pic="http://schemas.openxmlformats.org/drawingml/2006/picture">
+                  <wp:extent cx="1584000" cy="3427938"/>
+                  <wp:docPr id="1" name="Picture 1"/>
+                  <wp:cNvGraphicFramePr>
+                    <a:graphicFrameLocks noChangeAspect="1"/>
+                  </wp:cNvGraphicFramePr>
+                  <a:graphic>
+                    <a:graphicData uri="http://schemas.openxmlformats.org/drawingml/2006/picture">
+                      <pic:pic>
+                        <pic:nvPicPr>
+                          <pic:cNvPr id="0" name="s4-01-login.png"/>
+                          <pic:cNvPicPr/>
+                        </pic:nvPicPr>
+                        <pic:blipFill>
+                          <a:blip r:embed="rId13"/>
+                          <a:stretch>
+                            <a:fillRect/>
+                          </a:stretch>
+                        </pic:blipFill>
+                        <pic:spPr>
+                          <a:xfrm>
+                            <a:off x="0" y="0"/>
+                            <a:ext cx="1584000" cy="3427938"/>
+                          </a:xfrm>
+                          <a:prstGeom prst="rect"/>
+                        </pic:spPr>
+                      </pic:pic>
+                    </a:graphicData>
+                  </a:graphic>
+                </wp:inline>
+              </w:drawing>
+            </w:r>
+          </w:p>
+        </w:tc>
+        <w:tc>
+          <w:tcPr>
+            <w:tcW w:type="dxa" w:w="3289"/>
+          </w:tcPr>
+          <w:p>
+            <w:pPr>
+              <w:jc w:val="center"/>
+            </w:pPr>
+            <w:r>
+              <w:drawing>
+                <wp:inline xmlns:a="http://schemas.openxmlformats.org/drawingml/2006/main" xmlns:pic="http://schemas.openxmlformats.org/drawingml/2006/picture">
+                  <wp:extent cx="1584000" cy="3427938"/>
+                  <wp:docPr id="2" name="Picture 2"/>
+                  <wp:cNvGraphicFramePr>
+                    <a:graphicFrameLocks noChangeAspect="1"/>
+                  </wp:cNvGraphicFramePr>
+                  <a:graphic>
+                    <a:graphicData uri="http://schemas.openxmlformats.org/drawingml/2006/picture">
+                      <pic:pic>
+                        <pic:nvPicPr>
+                          <pic:cNvPr id="0" name="s2-02-inicio.png"/>
+                          <pic:cNvPicPr/>
+                        </pic:nvPicPr>
+                        <pic:blipFill>
+                          <a:blip r:embed="rId14"/>
+                          <a:stretch>
+                            <a:fillRect/>
+                          </a:stretch>
+                        </pic:blipFill>
+                        <pic:spPr>
+                          <a:xfrm>
+                            <a:off x="0" y="0"/>
+                            <a:ext cx="1584000" cy="3427938"/>
+                          </a:xfrm>
+                          <a:prstGeom prst="rect"/>
+                        </pic:spPr>
+                      </pic:pic>
+                    </a:graphicData>
+                  </a:graphic>
+                </wp:inline>
+              </w:drawing>
+            </w:r>
+          </w:p>
+        </w:tc>
+        <w:tc>
+          <w:tcPr>
+            <w:tcW w:type="dxa" w:w="3289"/>
+          </w:tcPr>
+          <w:p>
+            <w:pPr>
+              <w:jc w:val="center"/>
+            </w:pPr>
+            <w:r>
+              <w:drawing>
+                <wp:inline xmlns:a="http://schemas.openxmlformats.org/drawingml/2006/main" xmlns:pic="http://schemas.openxmlformats.org/drawingml/2006/picture">
+                  <wp:extent cx="1584000" cy="3427938"/>
+                  <wp:docPr id="3" name="Picture 3"/>
+                  <wp:cNvGraphicFramePr>
+                    <a:graphicFrameLocks noChangeAspect="1"/>
+                  </wp:cNvGraphicFramePr>
+                  <a:graphic>
+                    <a:graphicData uri="http://schemas.openxmlformats.org/drawingml/2006/picture">
+                      <pic:pic>
+                        <pic:nvPicPr>
+                          <pic:cNvPr id="0" name="s2-08-perfil.png"/>
+                          <pic:cNvPicPr/>
+                        </pic:nvPicPr>
+                        <pic:blipFill>
+                          <a:blip r:embed="rId15"/>
+                          <a:stretch>
+                            <a:fillRect/>
+                          </a:stretch>
+                        </pic:blipFill>
+                        <pic:spPr>
+                          <a:xfrm>
+                            <a:off x="0" y="0"/>
+                            <a:ext cx="1584000" cy="3427938"/>
+                          </a:xfrm>
+                          <a:prstGeom prst="rect"/>
+                        </pic:spPr>
+                      </pic:pic>
+                    </a:graphicData>
+                  </a:graphic>
+                </wp:inline>
+              </w:drawing>
+            </w:r>
+          </w:p>
+        </w:tc>
+      </w:tr>
+      <w:tr>
+        <w:tc>
+          <w:tcPr>
+            <w:tcW w:type="dxa" w:w="3289"/>
+          </w:tcPr>
+          <w:p>
+            <w:pPr>
+              <w:jc w:val="center"/>
+            </w:pPr>
+            <w:r>
+              <w:rPr>
+                <w:i/>
+                <w:color w:val="5E6962"/>
+                <w:sz w:val="18"/>
+              </w:rPr>
+              <w:t>Figura 1 — Login integrado à API DummyJSON.</w:t>
+            </w:r>
+          </w:p>
+        </w:tc>
+        <w:tc>
+          <w:tcPr>
+            <w:tcW w:type="dxa" w:w="3289"/>
+          </w:tcPr>
+          <w:p>
+            <w:pPr>
+              <w:jc w:val="center"/>
+            </w:pPr>
+            <w:r>
+              <w:rPr>
+                <w:i/>
+                <w:color w:val="5E6962"/>
+                <w:sz w:val="18"/>
+              </w:rPr>
+              <w:t>Figura 2 — Início com o nome da sessão.</w:t>
+            </w:r>
+          </w:p>
+        </w:tc>
+        <w:tc>
+          <w:tcPr>
+            <w:tcW w:type="dxa" w:w="3289"/>
+          </w:tcPr>
+          <w:p>
+            <w:pPr>
+              <w:jc w:val="center"/>
+            </w:pPr>
+            <w:r>
+              <w:rPr>
+                <w:i/>
+                <w:color w:val="5E6962"/>
+                <w:sz w:val="18"/>
+              </w:rPr>
+              <w:t>Figura 3 — Perfil com usuário e opção Sair.</w:t>
+            </w:r>
+          </w:p>
+        </w:tc>
+      </w:tr>
+    </w:tbl>
+    <w:p/>
+    <w:p>
+      <w:pPr>
+        <w:spacing w:after="120" w:line="269" w:lineRule="auto"/>
+      </w:pPr>
+      <w:r>
+        <w:t>No Android e iOS, os tokens são persistidos com Expo SecureStore; na web, com Async Storage, porque o SecureStore não existe no navegador. Ao iniciar, o SessionProvider restaura e valida a sessão salva: se for válida, o app abre direto na navegação principal; se tiver expirado (60 minutos) ou estiver corrompida, é descartada e a pessoa volta às boas-vindas.</w:t>
+      </w:r>
+    </w:p>
+    <w:p>
+      <w:pPr>
+        <w:pageBreakBefore/>
+        <w:spacing w:before="40" w:after="160"/>
+      </w:pPr>
+      <w:r>
+        <w:rPr>
+          <w:b/>
+          <w:color w:val="101713"/>
+          <w:sz w:val="46"/>
+        </w:rPr>
+        <w:t>4. Caching local</w:t>
+      </w:r>
+    </w:p>
+    <w:p>
+      <w:pPr>
+        <w:spacing w:after="240"/>
+      </w:pPr>
+      <w:r>
+        <w:rPr>
+          <w:b/>
+          <w:color w:val="42634F"/>
+          <w:sz w:val="22"/>
+        </w:rPr>
+        <w:t>Itens em cache e telas em que foi aplicado</w:t>
+      </w:r>
+    </w:p>
+    <w:tbl>
+      <w:tblPr>
+        <w:tblW w:type="auto" w:w="0"/>
+        <w:jc w:val="center"/>
+        <w:tblLayout w:type="fixed"/>
+        <w:tblLook w:firstColumn="1" w:firstRow="1" w:lastColumn="0" w:lastRow="0" w:noHBand="0" w:noVBand="1" w:val="04A0"/>
+      </w:tblPr>
+      <w:tblGrid>
+        <w:gridCol w:w="2466"/>
+        <w:gridCol w:w="2466"/>
+        <w:gridCol w:w="2466"/>
+        <w:gridCol w:w="2466"/>
+      </w:tblGrid>
+      <w:tr>
+        <w:tc>
+          <w:tcPr>
+            <w:tcW w:type="dxa" w:w="2381"/>
+            <w:shd w:fill="173F2A"/>
+            <w:tcMar>
+              <w:top w:w="100" w:type="dxa"/>
+              <w:start w:w="120" w:type="dxa"/>
+              <w:bottom w:w="100" w:type="dxa"/>
+              <w:end w:w="120" w:type="dxa"/>
+            </w:tcMar>
+          </w:tcPr>
+          <w:p>
+            <w:r>
+              <w:rPr>
+                <w:b/>
+                <w:color w:val="FFFFFF"/>
+              </w:rPr>
+              <w:t>Item em cache</w:t>
+            </w:r>
+          </w:p>
+        </w:tc>
+        <w:tc>
+          <w:tcPr>
+            <w:tcW w:type="dxa" w:w="3288"/>
+            <w:shd w:fill="173F2A"/>
+            <w:tcMar>
+              <w:top w:w="100" w:type="dxa"/>
+              <w:start w:w="120" w:type="dxa"/>
+              <w:bottom w:w="100" w:type="dxa"/>
+              <w:end w:w="120" w:type="dxa"/>
+            </w:tcMar>
+          </w:tcPr>
+          <w:p>
+            <w:r>
+              <w:rPr>
+                <w:b/>
+                <w:color w:val="FFFFFF"/>
+              </w:rPr>
+              <w:t>Conteúdo</w:t>
+            </w:r>
+          </w:p>
+        </w:tc>
+        <w:tc>
+          <w:tcPr>
+            <w:tcW w:type="dxa" w:w="1928"/>
+            <w:shd w:fill="173F2A"/>
+            <w:tcMar>
+              <w:top w:w="100" w:type="dxa"/>
+              <w:start w:w="120" w:type="dxa"/>
+              <w:bottom w:w="100" w:type="dxa"/>
+              <w:end w:w="120" w:type="dxa"/>
+            </w:tcMar>
+          </w:tcPr>
+          <w:p>
+            <w:r>
+              <w:rPr>
+                <w:b/>
+                <w:color w:val="FFFFFF"/>
+              </w:rPr>
+              <w:t>Validade</w:t>
+            </w:r>
+          </w:p>
+        </w:tc>
+        <w:tc>
+          <w:tcPr>
+            <w:tcW w:type="dxa" w:w="1814"/>
+            <w:shd w:fill="173F2A"/>
+            <w:tcMar>
+              <w:top w:w="100" w:type="dxa"/>
+              <w:start w:w="120" w:type="dxa"/>
+              <w:bottom w:w="100" w:type="dxa"/>
+              <w:end w:w="120" w:type="dxa"/>
+            </w:tcMar>
+          </w:tcPr>
+          <w:p>
+            <w:r>
+              <w:rPr>
+                <w:b/>
+                <w:color w:val="FFFFFF"/>
+              </w:rPr>
+              <w:t>Telas</w:t>
+            </w:r>
+          </w:p>
+        </w:tc>
+      </w:tr>
+      <w:tr>
+        <w:tc>
+          <w:tcPr>
+            <w:tcW w:type="dxa" w:w="2381"/>
+            <w:shd w:fill="F4FFD7"/>
+            <w:tcMar>
+              <w:top w:w="100" w:type="dxa"/>
+              <w:start w:w="120" w:type="dxa"/>
+              <w:bottom w:w="100" w:type="dxa"/>
+              <w:end w:w="120" w:type="dxa"/>
+            </w:tcMar>
+          </w:tcPr>
+          <w:p>
+            <w:r>
+              <w:t>Catálogo de produtos (@reuse/products-v1)</w:t>
+            </w:r>
+          </w:p>
+        </w:tc>
+        <w:tc>
+          <w:tcPr>
+            <w:tcW w:type="dxa" w:w="3288"/>
+            <w:shd w:fill="F4FFD7"/>
+            <w:tcMar>
+              <w:top w:w="100" w:type="dxa"/>
+              <w:start w:w="120" w:type="dxa"/>
+              <w:bottom w:w="100" w:type="dxa"/>
+              <w:end w:w="120" w:type="dxa"/>
+            </w:tcMar>
+          </w:tcPr>
+          <w:p>
+            <w:r>
+              <w:t>12 produtos da API (id, title, description, price, category, thumbnail) e savedAt</w:t>
+            </w:r>
+          </w:p>
+        </w:tc>
+        <w:tc>
+          <w:tcPr>
+            <w:tcW w:type="dxa" w:w="1928"/>
+            <w:shd w:fill="F4FFD7"/>
+            <w:tcMar>
+              <w:top w:w="100" w:type="dxa"/>
+              <w:start w:w="120" w:type="dxa"/>
+              <w:bottom w:w="100" w:type="dxa"/>
+              <w:end w:w="120" w:type="dxa"/>
+            </w:tcMar>
+          </w:tcPr>
+          <w:p>
+            <w:r>
+              <w:t>15 minutos; depois vira fallback offline</w:t>
+            </w:r>
+          </w:p>
+        </w:tc>
+        <w:tc>
+          <w:tcPr>
+            <w:tcW w:type="dxa" w:w="1814"/>
+            <w:shd w:fill="F4FFD7"/>
+            <w:tcMar>
+              <w:top w:w="100" w:type="dxa"/>
+              <w:start w:w="120" w:type="dxa"/>
+              <w:bottom w:w="100" w:type="dxa"/>
+              <w:end w:w="120" w:type="dxa"/>
+            </w:tcMar>
+          </w:tcPr>
+          <w:p>
+            <w:r>
+              <w:t>Catálogo online</w:t>
+            </w:r>
+          </w:p>
+        </w:tc>
+      </w:tr>
+      <w:tr>
+        <w:tc>
+          <w:tcPr>
+            <w:tcW w:type="dxa" w:w="2381"/>
+            <w:shd w:fill="FFFFFF"/>
+            <w:tcMar>
+              <w:top w:w="100" w:type="dxa"/>
+              <w:start w:w="120" w:type="dxa"/>
+              <w:bottom w:w="100" w:type="dxa"/>
+              <w:end w:w="120" w:type="dxa"/>
+            </w:tcMar>
+          </w:tcPr>
+          <w:p>
+            <w:r>
+              <w:t>Sessão (reuse-session-v1)</w:t>
+            </w:r>
+          </w:p>
+        </w:tc>
+        <w:tc>
+          <w:tcPr>
+            <w:tcW w:type="dxa" w:w="3288"/>
+            <w:shd w:fill="FFFFFF"/>
+            <w:tcMar>
+              <w:top w:w="100" w:type="dxa"/>
+              <w:start w:w="120" w:type="dxa"/>
+              <w:bottom w:w="100" w:type="dxa"/>
+              <w:end w:w="120" w:type="dxa"/>
+            </w:tcMar>
+          </w:tcPr>
+          <w:p>
+            <w:r>
+              <w:t>accessToken, refreshToken, expiresAt, id, username e nome</w:t>
+            </w:r>
+          </w:p>
+        </w:tc>
+        <w:tc>
+          <w:tcPr>
+            <w:tcW w:type="dxa" w:w="1928"/>
+            <w:shd w:fill="FFFFFF"/>
+            <w:tcMar>
+              <w:top w:w="100" w:type="dxa"/>
+              <w:start w:w="120" w:type="dxa"/>
+              <w:bottom w:w="100" w:type="dxa"/>
+              <w:end w:w="120" w:type="dxa"/>
+            </w:tcMar>
+          </w:tcPr>
+          <w:p>
+            <w:r>
+              <w:t>60 minutos</w:t>
+            </w:r>
+          </w:p>
+        </w:tc>
+        <w:tc>
+          <w:tcPr>
+            <w:tcW w:type="dxa" w:w="1814"/>
+            <w:shd w:fill="FFFFFF"/>
+            <w:tcMar>
+              <w:top w:w="100" w:type="dxa"/>
+              <w:start w:w="120" w:type="dxa"/>
+              <w:bottom w:w="100" w:type="dxa"/>
+              <w:end w:w="120" w:type="dxa"/>
+            </w:tcMar>
+          </w:tcPr>
+          <w:p>
+            <w:r>
+              <w:t>Login, Início e Perfil; restaurada ao abrir o app</w:t>
+            </w:r>
+          </w:p>
+        </w:tc>
+      </w:tr>
+    </w:tbl>
+    <w:p/>
+    <w:p>
+      <w:pPr>
+        <w:spacing w:after="120" w:line="269" w:lineRule="auto"/>
+      </w:pPr>
+      <w:r>
+        <w:t>O catálogo fica no Async Storage. A sessão fica no Expo SecureStore no Android/iOS e no Async Storage na web. Favoritos, rascunho e anúncios da sprint anterior continuam salvos localmente no Async Storage.</w:t>
       </w:r>
     </w:p>
     <w:tbl>
@@ -896,8 +1791,8 @@
             <w:r>
               <w:drawing>
                 <wp:inline xmlns:a="http://schemas.openxmlformats.org/drawingml/2006/main" xmlns:pic="http://schemas.openxmlformats.org/drawingml/2006/picture">
-                  <wp:extent cx="2304000" cy="4986092"/>
-                  <wp:docPr id="1" name="Picture 1"/>
+                  <wp:extent cx="1440000" cy="3116308"/>
+                  <wp:docPr id="4" name="Picture 4"/>
                   <wp:cNvGraphicFramePr>
                     <a:graphicFrameLocks noChangeAspect="1"/>
                   </wp:cNvGraphicFramePr>
@@ -905,11 +1800,11 @@
                     <a:graphicData uri="http://schemas.openxmlformats.org/drawingml/2006/picture">
                       <pic:pic>
                         <pic:nvPicPr>
-                          <pic:cNvPr id="0" name="s4-01-login.png"/>
+                          <pic:cNvPr id="0" name="s4-02-catalogo-api.png"/>
                           <pic:cNvPicPr/>
                         </pic:nvPicPr>
                         <pic:blipFill>
-                          <a:blip r:embed="rId13"/>
+                          <a:blip r:embed="rId16"/>
                           <a:stretch>
                             <a:fillRect/>
                           </a:stretch>
@@ -917,7 +1812,7 @@
                         <pic:spPr>
                           <a:xfrm>
                             <a:off x="0" y="0"/>
-                            <a:ext cx="2304000" cy="4986092"/>
+                            <a:ext cx="1440000" cy="3116308"/>
                           </a:xfrm>
                           <a:prstGeom prst="rect"/>
                         </pic:spPr>
@@ -940,288 +1835,7 @@
             <w:r>
               <w:drawing>
                 <wp:inline xmlns:a="http://schemas.openxmlformats.org/drawingml/2006/main" xmlns:pic="http://schemas.openxmlformats.org/drawingml/2006/picture">
-                  <wp:extent cx="2304000" cy="4986092"/>
-                  <wp:docPr id="2" name="Picture 2"/>
-                  <wp:cNvGraphicFramePr>
-                    <a:graphicFrameLocks noChangeAspect="1"/>
-                  </wp:cNvGraphicFramePr>
-                  <a:graphic>
-                    <a:graphicData uri="http://schemas.openxmlformats.org/drawingml/2006/picture">
-                      <pic:pic>
-                        <pic:nvPicPr>
-                          <pic:cNvPr id="0" name="s2-02-inicio.png"/>
-                          <pic:cNvPicPr/>
-                        </pic:nvPicPr>
-                        <pic:blipFill>
-                          <a:blip r:embed="rId14"/>
-                          <a:stretch>
-                            <a:fillRect/>
-                          </a:stretch>
-                        </pic:blipFill>
-                        <pic:spPr>
-                          <a:xfrm>
-                            <a:off x="0" y="0"/>
-                            <a:ext cx="2304000" cy="4986092"/>
-                          </a:xfrm>
-                          <a:prstGeom prst="rect"/>
-                        </pic:spPr>
-                      </pic:pic>
-                    </a:graphicData>
-                  </a:graphic>
-                </wp:inline>
-              </w:drawing>
-            </w:r>
-          </w:p>
-        </w:tc>
-      </w:tr>
-      <w:tr>
-        <w:tc>
-          <w:tcPr>
-            <w:tcW w:type="dxa" w:w="4933"/>
-          </w:tcPr>
-          <w:p>
-            <w:pPr>
-              <w:jc w:val="center"/>
-            </w:pPr>
-            <w:r>
-              <w:rPr>
-                <w:i/>
-                <w:color w:val="5E6962"/>
-                <w:sz w:val="18"/>
-              </w:rPr>
-              <w:t>Figura 1 — Login integrado à API DummyJSON.</w:t>
-            </w:r>
-          </w:p>
-        </w:tc>
-        <w:tc>
-          <w:tcPr>
-            <w:tcW w:type="dxa" w:w="4933"/>
-          </w:tcPr>
-          <w:p>
-            <w:pPr>
-              <w:jc w:val="center"/>
-            </w:pPr>
-            <w:r>
-              <w:rPr>
-                <w:i/>
-                <w:color w:val="5E6962"/>
-                <w:sz w:val="18"/>
-              </w:rPr>
-              <w:t>Figura 2 — Início autenticada com o nome da sessão e o catálogo online.</w:t>
-            </w:r>
-          </w:p>
-        </w:tc>
-      </w:tr>
-    </w:tbl>
-    <w:p/>
-    <w:p>
-      <w:pPr>
-        <w:spacing w:after="120" w:line="269" w:lineRule="auto"/>
-      </w:pPr>
-      <w:r>
-        <w:t>No Android e iOS, os tokens são persistidos com Expo SecureStore. Na web, o aplicativo usa Async Storage, porque o SecureStore não existe no navegador. Ao iniciar, o SessionProvider restaura e valida a sessão salva antes de montar as rotas protegidas.</w:t>
-      </w:r>
-    </w:p>
-    <w:p>
-      <w:pPr>
-        <w:pStyle w:val="ListBullet"/>
-        <w:spacing w:after="60"/>
-      </w:pPr>
-      <w:r>
-        <w:t>Sem sessão válida ou após 60 minutos: a pessoa vê Boas-vindas e Login.</w:t>
-      </w:r>
-    </w:p>
-    <w:p>
-      <w:pPr>
-        <w:pStyle w:val="ListBullet"/>
-        <w:spacing w:after="60"/>
-      </w:pPr>
-      <w:r>
-        <w:t>Sessão válida: o aplicativo abre direto na navegação principal.</w:t>
-      </w:r>
-    </w:p>
-    <w:p>
-      <w:pPr>
-        <w:pStyle w:val="ListBullet"/>
-        <w:spacing w:after="60"/>
-      </w:pPr>
-      <w:r>
-        <w:t>Logout: o botão Sair do Perfil remove a sessão e retorna às boas-vindas.</w:t>
-      </w:r>
-    </w:p>
-    <w:p>
-      <w:pPr>
-        <w:pStyle w:val="ListBullet"/>
-        <w:spacing w:after="60"/>
-      </w:pPr>
-      <w:r>
-        <w:t>Dados locais inválidos: são descartados em vez de quebrar o aplicativo.</w:t>
-      </w:r>
-    </w:p>
-    <w:p>
-      <w:r>
-        <w:br w:type="page"/>
-      </w:r>
-    </w:p>
-    <w:p>
-      <w:pPr>
-        <w:jc w:val="center"/>
-      </w:pPr>
-      <w:r>
-        <w:drawing>
-          <wp:inline xmlns:a="http://schemas.openxmlformats.org/drawingml/2006/main" xmlns:pic="http://schemas.openxmlformats.org/drawingml/2006/picture">
-            <wp:extent cx="2304000" cy="4986092"/>
-            <wp:docPr id="3" name="Picture 3"/>
-            <wp:cNvGraphicFramePr>
-              <a:graphicFrameLocks noChangeAspect="1"/>
-            </wp:cNvGraphicFramePr>
-            <a:graphic>
-              <a:graphicData uri="http://schemas.openxmlformats.org/drawingml/2006/picture">
-                <pic:pic>
-                  <pic:nvPicPr>
-                    <pic:cNvPr id="0" name="s2-08-perfil.png"/>
-                    <pic:cNvPicPr/>
-                  </pic:nvPicPr>
-                  <pic:blipFill>
-                    <a:blip r:embed="rId15"/>
-                    <a:stretch>
-                      <a:fillRect/>
-                    </a:stretch>
-                  </pic:blipFill>
-                  <pic:spPr>
-                    <a:xfrm>
-                      <a:off x="0" y="0"/>
-                      <a:ext cx="2304000" cy="4986092"/>
-                    </a:xfrm>
-                    <a:prstGeom prst="rect"/>
-                  </pic:spPr>
-                </pic:pic>
-              </a:graphicData>
-            </a:graphic>
-          </wp:inline>
-        </w:drawing>
-      </w:r>
-    </w:p>
-    <w:p>
-      <w:pPr>
-        <w:spacing w:before="60" w:after="160"/>
-        <w:jc w:val="center"/>
-      </w:pPr>
-      <w:r>
-        <w:rPr>
-          <w:i/>
-          <w:color w:val="5E6962"/>
-          <w:sz w:val="18"/>
-        </w:rPr>
-        <w:t>Figura 3 — Perfil com o usuário autenticado e a opção Sair.</w:t>
-      </w:r>
-    </w:p>
-    <w:p>
-      <w:pPr>
-        <w:spacing w:after="120" w:line="269" w:lineRule="auto"/>
-      </w:pPr>
-      <w:r>
-        <w:t>O Perfil identifica a pessoa pelo nome e usuário recebidos da API e explica onde os tokens ficam guardados. Favoritos, rascunhos, anúncios e pontos de impacto continuam somente no dispositivo.</w:t>
-      </w:r>
-    </w:p>
-    <w:p>
-      <w:r>
-        <w:br w:type="page"/>
-      </w:r>
-    </w:p>
-    <w:p>
-      <w:pPr>
-        <w:spacing w:before="40" w:after="160"/>
-      </w:pPr>
-      <w:r>
-        <w:rPr>
-          <w:b/>
-          <w:color w:val="101713"/>
-          <w:sz w:val="46"/>
-        </w:rPr>
-        <w:t>4. Cache local e experiência offline</w:t>
-      </w:r>
-    </w:p>
-    <w:p>
-      <w:pPr>
-        <w:spacing w:after="240"/>
-      </w:pPr>
-      <w:r>
-        <w:rPr>
-          <w:b/>
-          <w:color w:val="42634F"/>
-          <w:sz w:val="22"/>
-        </w:rPr>
-        <w:t>Catálogo rápido e resiliente a falhas de rede</w:t>
-      </w:r>
-    </w:p>
-    <w:tbl>
-      <w:tblPr>
-        <w:tblW w:type="auto" w:w="0"/>
-        <w:jc w:val="center"/>
-        <w:tblLook w:firstColumn="1" w:firstRow="1" w:lastColumn="0" w:lastRow="0" w:noHBand="0" w:noVBand="1" w:val="04A0"/>
-      </w:tblPr>
-      <w:tblGrid>
-        <w:gridCol w:w="4933"/>
-        <w:gridCol w:w="4933"/>
-      </w:tblGrid>
-      <w:tr>
-        <w:tc>
-          <w:tcPr>
-            <w:tcW w:type="dxa" w:w="4933"/>
-          </w:tcPr>
-          <w:p>
-            <w:pPr>
-              <w:jc w:val="center"/>
-            </w:pPr>
-            <w:r>
-              <w:drawing>
-                <wp:inline xmlns:a="http://schemas.openxmlformats.org/drawingml/2006/main" xmlns:pic="http://schemas.openxmlformats.org/drawingml/2006/picture">
-                  <wp:extent cx="2304000" cy="4986092"/>
-                  <wp:docPr id="4" name="Picture 4"/>
-                  <wp:cNvGraphicFramePr>
-                    <a:graphicFrameLocks noChangeAspect="1"/>
-                  </wp:cNvGraphicFramePr>
-                  <a:graphic>
-                    <a:graphicData uri="http://schemas.openxmlformats.org/drawingml/2006/picture">
-                      <pic:pic>
-                        <pic:nvPicPr>
-                          <pic:cNvPr id="0" name="s4-02-catalogo-api.png"/>
-                          <pic:cNvPicPr/>
-                        </pic:nvPicPr>
-                        <pic:blipFill>
-                          <a:blip r:embed="rId16"/>
-                          <a:stretch>
-                            <a:fillRect/>
-                          </a:stretch>
-                        </pic:blipFill>
-                        <pic:spPr>
-                          <a:xfrm>
-                            <a:off x="0" y="0"/>
-                            <a:ext cx="2304000" cy="4986092"/>
-                          </a:xfrm>
-                          <a:prstGeom prst="rect"/>
-                        </pic:spPr>
-                      </pic:pic>
-                    </a:graphicData>
-                  </a:graphic>
-                </wp:inline>
-              </w:drawing>
-            </w:r>
-          </w:p>
-        </w:tc>
-        <w:tc>
-          <w:tcPr>
-            <w:tcW w:type="dxa" w:w="4933"/>
-          </w:tcPr>
-          <w:p>
-            <w:pPr>
-              <w:jc w:val="center"/>
-            </w:pPr>
-            <w:r>
-              <w:drawing>
-                <wp:inline xmlns:a="http://schemas.openxmlformats.org/drawingml/2006/main" xmlns:pic="http://schemas.openxmlformats.org/drawingml/2006/picture">
-                  <wp:extent cx="2304000" cy="4986092"/>
+                  <wp:extent cx="1440000" cy="3116308"/>
                   <wp:docPr id="5" name="Picture 5"/>
                   <wp:cNvGraphicFramePr>
                     <a:graphicFrameLocks noChangeAspect="1"/>
@@ -1242,7 +1856,7 @@
                         <pic:spPr>
                           <a:xfrm>
                             <a:off x="0" y="0"/>
-                            <a:ext cx="2304000" cy="4986092"/>
+                            <a:ext cx="1440000" cy="3116308"/>
                           </a:xfrm>
                           <a:prstGeom prst="rect"/>
                         </pic:spPr>
@@ -1297,14 +1911,6 @@
     <w:p/>
     <w:p>
       <w:pPr>
-        <w:spacing w:after="120" w:line="269" w:lineRule="auto"/>
-      </w:pPr>
-      <w:r>
-        <w:t>O cache usa a chave @reuse/products-v1 e guarda a lista validada de produtos com savedAt. O prazo de validade é de 15 minutos.</w:t>
-      </w:r>
-    </w:p>
-    <w:p>
-      <w:pPr>
         <w:pStyle w:val="Heading1"/>
         <w:spacing w:before="200" w:after="100"/>
       </w:pPr>
@@ -1345,25 +1951,12 @@
         <w:spacing w:after="60"/>
       </w:pPr>
       <w:r>
-        <w:t>Falha sem cache: mostra erro e botão para tentar novamente.</w:t>
+        <w:t>Falha sem cache: mostra erro e botão para tentar novamente. Falhas do armazenamento não impedem o uso dos dados da rede.</w:t>
       </w:r>
     </w:p>
     <w:p>
       <w:pPr>
-        <w:pStyle w:val="ListBullet"/>
-        <w:spacing w:after="60"/>
-      </w:pPr>
-      <w:r>
-        <w:t>Falhas de leitura ou gravação do armazenamento não impedem o uso dos dados da rede.</w:t>
-      </w:r>
-    </w:p>
-    <w:p>
-      <w:r>
-        <w:br w:type="page"/>
-      </w:r>
-    </w:p>
-    <w:p>
-      <w:pPr>
+        <w:pageBreakBefore/>
         <w:spacing w:before="40" w:after="160"/>
       </w:pPr>
       <w:r>
@@ -1734,12 +2327,8 @@
       </w:r>
     </w:p>
     <w:p>
-      <w:r>
-        <w:br w:type="page"/>
-      </w:r>
-    </w:p>
-    <w:p>
       <w:pPr>
+        <w:pageBreakBefore/>
         <w:spacing w:before="40" w:after="160"/>
       </w:pPr>
       <w:r>

</xml_diff>